<commit_message>
proposal template and commitment document v1
</commit_message>
<xml_diff>
--- a/Commitment Document for DSPRO1.docx
+++ b/Commitment Document for DSPRO1.docx
@@ -70,43 +70,242 @@
     </w:p>
     <w:p>
       <w:pPr>
-        <w:rPr>
-          <w:lang w:val="en-US"/>
+        <w:pStyle w:val="NoSpacing"/>
+        <w:rPr>
+          <w:lang w:val="en-GB"/>
         </w:rPr>
       </w:pPr>
       <w:r>
         <w:rPr>
-          <w:lang w:val="en-US"/>
-        </w:rPr>
-        <w:t>Name – Tasks</w:t>
+          <w:lang w:val="en-GB"/>
+        </w:rPr>
+        <w:t>Godovskii Viacheslav I.BSCAIML_F23.2201</w:t>
       </w:r>
     </w:p>
     <w:p>
       <w:pPr>
-        <w:rPr>
-          <w:lang w:val="en-US"/>
+        <w:pStyle w:val="NoSpacing"/>
+        <w:numPr>
+          <w:ilvl w:val="0"/>
+          <w:numId w:val="3"/>
+        </w:numPr>
+        <w:rPr>
+          <w:lang w:val="en-GB"/>
         </w:rPr>
       </w:pPr>
       <w:r>
         <w:rPr>
-          <w:lang w:val="en-US"/>
-        </w:rPr>
-        <w:t>Name – Tasks</w:t>
+          <w:lang w:val="en-GB"/>
+        </w:rPr>
+        <w:t>Project Management</w:t>
       </w:r>
     </w:p>
     <w:p>
       <w:pPr>
-        <w:rPr>
-          <w:lang w:val="en-US"/>
+        <w:pStyle w:val="NoSpacing"/>
+        <w:numPr>
+          <w:ilvl w:val="0"/>
+          <w:numId w:val="3"/>
+        </w:numPr>
+        <w:rPr>
+          <w:lang w:val="en-GB"/>
         </w:rPr>
       </w:pPr>
       <w:r>
         <w:rPr>
-          <w:lang w:val="en-US"/>
-        </w:rPr>
-        <w:t xml:space="preserve">Name – Tasks </w:t>
+          <w:lang w:val="en-GB"/>
+        </w:rPr>
+        <w:t>Model Training / Testing</w:t>
       </w:r>
     </w:p>
+    <w:p>
+      <w:pPr>
+        <w:pStyle w:val="NoSpacing"/>
+        <w:numPr>
+          <w:ilvl w:val="0"/>
+          <w:numId w:val="3"/>
+        </w:numPr>
+        <w:rPr>
+          <w:lang w:val="en-GB"/>
+        </w:rPr>
+      </w:pPr>
+      <w:r>
+        <w:rPr>
+          <w:lang w:val="en-GB"/>
+        </w:rPr>
+        <w:t>Feature Engineering</w:t>
+      </w:r>
+    </w:p>
+    <w:p>
+      <w:pPr>
+        <w:pStyle w:val="NoSpacing"/>
+        <w:numPr>
+          <w:ilvl w:val="0"/>
+          <w:numId w:val="3"/>
+        </w:numPr>
+        <w:rPr>
+          <w:lang w:val="en-GB"/>
+        </w:rPr>
+      </w:pPr>
+      <w:r>
+        <w:rPr>
+          <w:lang w:val="en-GB"/>
+        </w:rPr>
+        <w:t>Performance Tracking</w:t>
+      </w:r>
+    </w:p>
+    <w:p>
+      <w:pPr>
+        <w:rPr>
+          <w:lang w:val="en-GB"/>
+        </w:rPr>
+      </w:pPr>
+    </w:p>
+    <w:p>
+      <w:pPr>
+        <w:rPr>
+          <w:lang w:val="en-GB"/>
+        </w:rPr>
+      </w:pPr>
+      <w:r>
+        <w:rPr>
+          <w:lang w:val="en-GB"/>
+        </w:rPr>
+        <w:t>Gonzalez Diego I.BSCAIML_F23.2201</w:t>
+      </w:r>
+    </w:p>
+    <w:p>
+      <w:pPr>
+        <w:pStyle w:val="NoSpacing"/>
+        <w:numPr>
+          <w:ilvl w:val="0"/>
+          <w:numId w:val="2"/>
+        </w:numPr>
+        <w:rPr>
+          <w:lang w:val="en-GB"/>
+        </w:rPr>
+      </w:pPr>
+      <w:r>
+        <w:rPr>
+          <w:lang w:val="en-GB"/>
+        </w:rPr>
+        <w:t xml:space="preserve">Acquire Business document types </w:t>
+      </w:r>
+    </w:p>
+    <w:p>
+      <w:pPr>
+        <w:pStyle w:val="NoSpacing"/>
+        <w:numPr>
+          <w:ilvl w:val="0"/>
+          <w:numId w:val="2"/>
+        </w:numPr>
+        <w:rPr>
+          <w:lang w:val="en-GB"/>
+        </w:rPr>
+      </w:pPr>
+      <w:r>
+        <w:rPr>
+          <w:lang w:val="en-GB"/>
+        </w:rPr>
+        <w:t>Model Training / Testing</w:t>
+      </w:r>
+    </w:p>
+    <w:p>
+      <w:pPr>
+        <w:pStyle w:val="ListParagraph"/>
+        <w:numPr>
+          <w:ilvl w:val="0"/>
+          <w:numId w:val="2"/>
+        </w:numPr>
+        <w:rPr>
+          <w:lang w:val="en-GB"/>
+        </w:rPr>
+      </w:pPr>
+      <w:r>
+        <w:rPr>
+          <w:lang w:val="en-GB"/>
+        </w:rPr>
+        <w:t>Documentation</w:t>
+      </w:r>
+    </w:p>
+    <w:p>
+      <w:pPr>
+        <w:pStyle w:val="ListParagraph"/>
+        <w:numPr>
+          <w:ilvl w:val="0"/>
+          <w:numId w:val="2"/>
+        </w:numPr>
+        <w:rPr>
+          <w:lang w:val="en-GB"/>
+        </w:rPr>
+      </w:pPr>
+      <w:r>
+        <w:rPr>
+          <w:lang w:val="en-GB"/>
+        </w:rPr>
+        <w:t>Real World Application</w:t>
+      </w:r>
+    </w:p>
+    <w:p>
+      <w:r>
+        <w:rPr>
+          <w:lang w:val="en-GB"/>
+        </w:rPr>
+        <w:br/>
+      </w:r>
+      <w:r>
+        <w:t>Häusler Kevin I.BSCAIML.2301</w:t>
+      </w:r>
+    </w:p>
+    <w:p>
+      <w:pPr>
+        <w:pStyle w:val="ListParagraph"/>
+        <w:numPr>
+          <w:ilvl w:val="0"/>
+          <w:numId w:val="1"/>
+        </w:numPr>
+      </w:pPr>
+      <w:r>
+        <w:t>Setting up ClearML</w:t>
+      </w:r>
+    </w:p>
+    <w:p>
+      <w:pPr>
+        <w:pStyle w:val="ListParagraph"/>
+        <w:numPr>
+          <w:ilvl w:val="0"/>
+          <w:numId w:val="1"/>
+        </w:numPr>
+      </w:pPr>
+      <w:r>
+        <w:t>Script to generate mock data</w:t>
+      </w:r>
+    </w:p>
+    <w:p>
+      <w:pPr>
+        <w:pStyle w:val="ListParagraph"/>
+        <w:numPr>
+          <w:ilvl w:val="0"/>
+          <w:numId w:val="1"/>
+        </w:numPr>
+      </w:pPr>
+      <w:r>
+        <w:t>API</w:t>
+      </w:r>
+    </w:p>
+    <w:p>
+      <w:pPr>
+        <w:pStyle w:val="ListParagraph"/>
+        <w:numPr>
+          <w:ilvl w:val="0"/>
+          <w:numId w:val="1"/>
+        </w:numPr>
+      </w:pPr>
+      <w:r>
+        <w:t>Demo</w:t>
+      </w:r>
+    </w:p>
+    <w:p/>
     <w:sectPr>
       <w:pgSz w:w="11906" w:h="16838"/>
       <w:pgMar w:top="1440" w:right="1440" w:bottom="1440" w:left="1440" w:header="708" w:footer="708" w:gutter="0"/>
@@ -117,6 +316,356 @@
 </w:document>
 </file>
 
+<file path=word/numbering.xml><?xml version="1.0" encoding="utf-8"?>
+<w:numbering xmlns:wpc="http://schemas.microsoft.com/office/word/2010/wordprocessingCanvas" xmlns:cx="http://schemas.microsoft.com/office/drawing/2014/chartex" xmlns:cx1="http://schemas.microsoft.com/office/drawing/2015/9/8/chartex" xmlns:cx2="http://schemas.microsoft.com/office/drawing/2015/10/21/chartex" xmlns:cx3="http://schemas.microsoft.com/office/drawing/2016/5/9/chartex" xmlns:cx4="http://schemas.microsoft.com/office/drawing/2016/5/10/chartex" xmlns:cx5="http://schemas.microsoft.com/office/drawing/2016/5/11/chartex" xmlns:cx6="http://schemas.microsoft.com/office/drawing/2016/5/12/chartex" xmlns:cx7="http://schemas.microsoft.com/office/drawing/2016/5/13/chartex" xmlns:cx8="http://schemas.microsoft.com/office/drawing/2016/5/14/chartex" xmlns:mc="http://schemas.openxmlformats.org/markup-compatibility/2006" xmlns:aink="http://schemas.microsoft.com/office/drawing/2016/ink" xmlns:am3d="http://schemas.microsoft.com/office/drawing/2017/model3d" xmlns:o="urn:schemas-microsoft-com:office:office" xmlns:oel="http://schemas.microsoft.com/office/2019/extlst" xmlns:r="http://schemas.openxmlformats.org/officeDocument/2006/relationships" xmlns:m="http://schemas.openxmlformats.org/officeDocument/2006/math" xmlns:v="urn:schemas-microsoft-com:vml" xmlns:wp14="http://schemas.microsoft.com/office/word/2010/wordprocessingDrawing" xmlns:wp="http://schemas.openxmlformats.org/drawingml/2006/wordprocessingDrawing" xmlns:w10="urn:schemas-microsoft-com:office:word" xmlns:w="http://schemas.openxmlformats.org/wordprocessingml/2006/main" xmlns:w14="http://schemas.microsoft.com/office/word/2010/wordml" xmlns:w15="http://schemas.microsoft.com/office/word/2012/wordml" xmlns:w16cex="http://schemas.microsoft.com/office/word/2018/wordml/cex" xmlns:w16cid="http://schemas.microsoft.com/office/word/2016/wordml/cid" xmlns:w16="http://schemas.microsoft.com/office/word/2018/wordml" xmlns:w16du="http://schemas.microsoft.com/office/word/2023/wordml/word16du" xmlns:w16sdtdh="http://schemas.microsoft.com/office/word/2020/wordml/sdtdatahash" xmlns:w16sdtfl="http://schemas.microsoft.com/office/word/2024/wordml/sdtformatlock" xmlns:w16se="http://schemas.microsoft.com/office/word/2015/wordml/symex" xmlns:wpg="http://schemas.microsoft.com/office/word/2010/wordprocessingGroup" xmlns:wpi="http://schemas.microsoft.com/office/word/2010/wordprocessingInk" xmlns:wne="http://schemas.microsoft.com/office/word/2006/wordml" xmlns:wps="http://schemas.microsoft.com/office/word/2010/wordprocessingShape" mc:Ignorable="w14 w15 w16se w16cid w16 w16cex w16sdtdh w16sdtfl w16du wp14">
+  <w:abstractNum w:abstractNumId="0" w15:restartNumberingAfterBreak="0">
+    <w:nsid w:val="091D4E10"/>
+    <w:multiLevelType w:val="hybridMultilevel"/>
+    <w:tmpl w:val="056EB8E0"/>
+    <w:lvl w:ilvl="0" w:tplc="F6305728">
+      <w:numFmt w:val="bullet"/>
+      <w:lvlText w:val="-"/>
+      <w:lvlJc w:val="left"/>
+      <w:pPr>
+        <w:ind w:left="720" w:hanging="360"/>
+      </w:pPr>
+      <w:rPr>
+        <w:rFonts w:ascii="Aptos" w:eastAsiaTheme="minorHAnsi" w:hAnsi="Aptos" w:cstheme="minorBidi" w:hint="default"/>
+      </w:rPr>
+    </w:lvl>
+    <w:lvl w:ilvl="1" w:tplc="0C000003" w:tentative="1">
+      <w:start w:val="1"/>
+      <w:numFmt w:val="bullet"/>
+      <w:lvlText w:val="o"/>
+      <w:lvlJc w:val="left"/>
+      <w:pPr>
+        <w:ind w:left="1440" w:hanging="360"/>
+      </w:pPr>
+      <w:rPr>
+        <w:rFonts w:ascii="Courier New" w:hAnsi="Courier New" w:cs="Courier New" w:hint="default"/>
+      </w:rPr>
+    </w:lvl>
+    <w:lvl w:ilvl="2" w:tplc="0C000005" w:tentative="1">
+      <w:start w:val="1"/>
+      <w:numFmt w:val="bullet"/>
+      <w:lvlText w:val=""/>
+      <w:lvlJc w:val="left"/>
+      <w:pPr>
+        <w:ind w:left="2160" w:hanging="360"/>
+      </w:pPr>
+      <w:rPr>
+        <w:rFonts w:ascii="Wingdings" w:hAnsi="Wingdings" w:hint="default"/>
+      </w:rPr>
+    </w:lvl>
+    <w:lvl w:ilvl="3" w:tplc="0C000001" w:tentative="1">
+      <w:start w:val="1"/>
+      <w:numFmt w:val="bullet"/>
+      <w:lvlText w:val=""/>
+      <w:lvlJc w:val="left"/>
+      <w:pPr>
+        <w:ind w:left="2880" w:hanging="360"/>
+      </w:pPr>
+      <w:rPr>
+        <w:rFonts w:ascii="Symbol" w:hAnsi="Symbol" w:hint="default"/>
+      </w:rPr>
+    </w:lvl>
+    <w:lvl w:ilvl="4" w:tplc="0C000003" w:tentative="1">
+      <w:start w:val="1"/>
+      <w:numFmt w:val="bullet"/>
+      <w:lvlText w:val="o"/>
+      <w:lvlJc w:val="left"/>
+      <w:pPr>
+        <w:ind w:left="3600" w:hanging="360"/>
+      </w:pPr>
+      <w:rPr>
+        <w:rFonts w:ascii="Courier New" w:hAnsi="Courier New" w:cs="Courier New" w:hint="default"/>
+      </w:rPr>
+    </w:lvl>
+    <w:lvl w:ilvl="5" w:tplc="0C000005" w:tentative="1">
+      <w:start w:val="1"/>
+      <w:numFmt w:val="bullet"/>
+      <w:lvlText w:val=""/>
+      <w:lvlJc w:val="left"/>
+      <w:pPr>
+        <w:ind w:left="4320" w:hanging="360"/>
+      </w:pPr>
+      <w:rPr>
+        <w:rFonts w:ascii="Wingdings" w:hAnsi="Wingdings" w:hint="default"/>
+      </w:rPr>
+    </w:lvl>
+    <w:lvl w:ilvl="6" w:tplc="0C000001" w:tentative="1">
+      <w:start w:val="1"/>
+      <w:numFmt w:val="bullet"/>
+      <w:lvlText w:val=""/>
+      <w:lvlJc w:val="left"/>
+      <w:pPr>
+        <w:ind w:left="5040" w:hanging="360"/>
+      </w:pPr>
+      <w:rPr>
+        <w:rFonts w:ascii="Symbol" w:hAnsi="Symbol" w:hint="default"/>
+      </w:rPr>
+    </w:lvl>
+    <w:lvl w:ilvl="7" w:tplc="0C000003" w:tentative="1">
+      <w:start w:val="1"/>
+      <w:numFmt w:val="bullet"/>
+      <w:lvlText w:val="o"/>
+      <w:lvlJc w:val="left"/>
+      <w:pPr>
+        <w:ind w:left="5760" w:hanging="360"/>
+      </w:pPr>
+      <w:rPr>
+        <w:rFonts w:ascii="Courier New" w:hAnsi="Courier New" w:cs="Courier New" w:hint="default"/>
+      </w:rPr>
+    </w:lvl>
+    <w:lvl w:ilvl="8" w:tplc="0C000005" w:tentative="1">
+      <w:start w:val="1"/>
+      <w:numFmt w:val="bullet"/>
+      <w:lvlText w:val=""/>
+      <w:lvlJc w:val="left"/>
+      <w:pPr>
+        <w:ind w:left="6480" w:hanging="360"/>
+      </w:pPr>
+      <w:rPr>
+        <w:rFonts w:ascii="Wingdings" w:hAnsi="Wingdings" w:hint="default"/>
+      </w:rPr>
+    </w:lvl>
+  </w:abstractNum>
+  <w:abstractNum w:abstractNumId="1" w15:restartNumberingAfterBreak="0">
+    <w:nsid w:val="106A5865"/>
+    <w:multiLevelType w:val="hybridMultilevel"/>
+    <w:tmpl w:val="9A401930"/>
+    <w:lvl w:ilvl="0" w:tplc="9E3C05A2">
+      <w:numFmt w:val="bullet"/>
+      <w:lvlText w:val="-"/>
+      <w:lvlJc w:val="left"/>
+      <w:pPr>
+        <w:ind w:left="720" w:hanging="360"/>
+      </w:pPr>
+      <w:rPr>
+        <w:rFonts w:ascii="Aptos" w:eastAsiaTheme="minorHAnsi" w:hAnsi="Aptos" w:cstheme="minorBidi" w:hint="default"/>
+      </w:rPr>
+    </w:lvl>
+    <w:lvl w:ilvl="1" w:tplc="0C000003" w:tentative="1">
+      <w:start w:val="1"/>
+      <w:numFmt w:val="bullet"/>
+      <w:lvlText w:val="o"/>
+      <w:lvlJc w:val="left"/>
+      <w:pPr>
+        <w:ind w:left="1440" w:hanging="360"/>
+      </w:pPr>
+      <w:rPr>
+        <w:rFonts w:ascii="Courier New" w:hAnsi="Courier New" w:cs="Courier New" w:hint="default"/>
+      </w:rPr>
+    </w:lvl>
+    <w:lvl w:ilvl="2" w:tplc="0C000005" w:tentative="1">
+      <w:start w:val="1"/>
+      <w:numFmt w:val="bullet"/>
+      <w:lvlText w:val=""/>
+      <w:lvlJc w:val="left"/>
+      <w:pPr>
+        <w:ind w:left="2160" w:hanging="360"/>
+      </w:pPr>
+      <w:rPr>
+        <w:rFonts w:ascii="Wingdings" w:hAnsi="Wingdings" w:hint="default"/>
+      </w:rPr>
+    </w:lvl>
+    <w:lvl w:ilvl="3" w:tplc="0C000001" w:tentative="1">
+      <w:start w:val="1"/>
+      <w:numFmt w:val="bullet"/>
+      <w:lvlText w:val=""/>
+      <w:lvlJc w:val="left"/>
+      <w:pPr>
+        <w:ind w:left="2880" w:hanging="360"/>
+      </w:pPr>
+      <w:rPr>
+        <w:rFonts w:ascii="Symbol" w:hAnsi="Symbol" w:hint="default"/>
+      </w:rPr>
+    </w:lvl>
+    <w:lvl w:ilvl="4" w:tplc="0C000003" w:tentative="1">
+      <w:start w:val="1"/>
+      <w:numFmt w:val="bullet"/>
+      <w:lvlText w:val="o"/>
+      <w:lvlJc w:val="left"/>
+      <w:pPr>
+        <w:ind w:left="3600" w:hanging="360"/>
+      </w:pPr>
+      <w:rPr>
+        <w:rFonts w:ascii="Courier New" w:hAnsi="Courier New" w:cs="Courier New" w:hint="default"/>
+      </w:rPr>
+    </w:lvl>
+    <w:lvl w:ilvl="5" w:tplc="0C000005" w:tentative="1">
+      <w:start w:val="1"/>
+      <w:numFmt w:val="bullet"/>
+      <w:lvlText w:val=""/>
+      <w:lvlJc w:val="left"/>
+      <w:pPr>
+        <w:ind w:left="4320" w:hanging="360"/>
+      </w:pPr>
+      <w:rPr>
+        <w:rFonts w:ascii="Wingdings" w:hAnsi="Wingdings" w:hint="default"/>
+      </w:rPr>
+    </w:lvl>
+    <w:lvl w:ilvl="6" w:tplc="0C000001" w:tentative="1">
+      <w:start w:val="1"/>
+      <w:numFmt w:val="bullet"/>
+      <w:lvlText w:val=""/>
+      <w:lvlJc w:val="left"/>
+      <w:pPr>
+        <w:ind w:left="5040" w:hanging="360"/>
+      </w:pPr>
+      <w:rPr>
+        <w:rFonts w:ascii="Symbol" w:hAnsi="Symbol" w:hint="default"/>
+      </w:rPr>
+    </w:lvl>
+    <w:lvl w:ilvl="7" w:tplc="0C000003" w:tentative="1">
+      <w:start w:val="1"/>
+      <w:numFmt w:val="bullet"/>
+      <w:lvlText w:val="o"/>
+      <w:lvlJc w:val="left"/>
+      <w:pPr>
+        <w:ind w:left="5760" w:hanging="360"/>
+      </w:pPr>
+      <w:rPr>
+        <w:rFonts w:ascii="Courier New" w:hAnsi="Courier New" w:cs="Courier New" w:hint="default"/>
+      </w:rPr>
+    </w:lvl>
+    <w:lvl w:ilvl="8" w:tplc="0C000005" w:tentative="1">
+      <w:start w:val="1"/>
+      <w:numFmt w:val="bullet"/>
+      <w:lvlText w:val=""/>
+      <w:lvlJc w:val="left"/>
+      <w:pPr>
+        <w:ind w:left="6480" w:hanging="360"/>
+      </w:pPr>
+      <w:rPr>
+        <w:rFonts w:ascii="Wingdings" w:hAnsi="Wingdings" w:hint="default"/>
+      </w:rPr>
+    </w:lvl>
+  </w:abstractNum>
+  <w:abstractNum w:abstractNumId="2" w15:restartNumberingAfterBreak="0">
+    <w:nsid w:val="63BD0BF1"/>
+    <w:multiLevelType w:val="hybridMultilevel"/>
+    <w:tmpl w:val="527AA9F2"/>
+    <w:lvl w:ilvl="0" w:tplc="7F2AD9AC">
+      <w:numFmt w:val="bullet"/>
+      <w:lvlText w:val="-"/>
+      <w:lvlJc w:val="left"/>
+      <w:pPr>
+        <w:ind w:left="720" w:hanging="360"/>
+      </w:pPr>
+      <w:rPr>
+        <w:rFonts w:ascii="Aptos" w:eastAsiaTheme="minorHAnsi" w:hAnsi="Aptos" w:cstheme="minorBidi" w:hint="default"/>
+      </w:rPr>
+    </w:lvl>
+    <w:lvl w:ilvl="1" w:tplc="0C000003" w:tentative="1">
+      <w:start w:val="1"/>
+      <w:numFmt w:val="bullet"/>
+      <w:lvlText w:val="o"/>
+      <w:lvlJc w:val="left"/>
+      <w:pPr>
+        <w:ind w:left="1440" w:hanging="360"/>
+      </w:pPr>
+      <w:rPr>
+        <w:rFonts w:ascii="Courier New" w:hAnsi="Courier New" w:cs="Courier New" w:hint="default"/>
+      </w:rPr>
+    </w:lvl>
+    <w:lvl w:ilvl="2" w:tplc="0C000005" w:tentative="1">
+      <w:start w:val="1"/>
+      <w:numFmt w:val="bullet"/>
+      <w:lvlText w:val=""/>
+      <w:lvlJc w:val="left"/>
+      <w:pPr>
+        <w:ind w:left="2160" w:hanging="360"/>
+      </w:pPr>
+      <w:rPr>
+        <w:rFonts w:ascii="Wingdings" w:hAnsi="Wingdings" w:hint="default"/>
+      </w:rPr>
+    </w:lvl>
+    <w:lvl w:ilvl="3" w:tplc="0C000001" w:tentative="1">
+      <w:start w:val="1"/>
+      <w:numFmt w:val="bullet"/>
+      <w:lvlText w:val=""/>
+      <w:lvlJc w:val="left"/>
+      <w:pPr>
+        <w:ind w:left="2880" w:hanging="360"/>
+      </w:pPr>
+      <w:rPr>
+        <w:rFonts w:ascii="Symbol" w:hAnsi="Symbol" w:hint="default"/>
+      </w:rPr>
+    </w:lvl>
+    <w:lvl w:ilvl="4" w:tplc="0C000003" w:tentative="1">
+      <w:start w:val="1"/>
+      <w:numFmt w:val="bullet"/>
+      <w:lvlText w:val="o"/>
+      <w:lvlJc w:val="left"/>
+      <w:pPr>
+        <w:ind w:left="3600" w:hanging="360"/>
+      </w:pPr>
+      <w:rPr>
+        <w:rFonts w:ascii="Courier New" w:hAnsi="Courier New" w:cs="Courier New" w:hint="default"/>
+      </w:rPr>
+    </w:lvl>
+    <w:lvl w:ilvl="5" w:tplc="0C000005" w:tentative="1">
+      <w:start w:val="1"/>
+      <w:numFmt w:val="bullet"/>
+      <w:lvlText w:val=""/>
+      <w:lvlJc w:val="left"/>
+      <w:pPr>
+        <w:ind w:left="4320" w:hanging="360"/>
+      </w:pPr>
+      <w:rPr>
+        <w:rFonts w:ascii="Wingdings" w:hAnsi="Wingdings" w:hint="default"/>
+      </w:rPr>
+    </w:lvl>
+    <w:lvl w:ilvl="6" w:tplc="0C000001" w:tentative="1">
+      <w:start w:val="1"/>
+      <w:numFmt w:val="bullet"/>
+      <w:lvlText w:val=""/>
+      <w:lvlJc w:val="left"/>
+      <w:pPr>
+        <w:ind w:left="5040" w:hanging="360"/>
+      </w:pPr>
+      <w:rPr>
+        <w:rFonts w:ascii="Symbol" w:hAnsi="Symbol" w:hint="default"/>
+      </w:rPr>
+    </w:lvl>
+    <w:lvl w:ilvl="7" w:tplc="0C000003" w:tentative="1">
+      <w:start w:val="1"/>
+      <w:numFmt w:val="bullet"/>
+      <w:lvlText w:val="o"/>
+      <w:lvlJc w:val="left"/>
+      <w:pPr>
+        <w:ind w:left="5760" w:hanging="360"/>
+      </w:pPr>
+      <w:rPr>
+        <w:rFonts w:ascii="Courier New" w:hAnsi="Courier New" w:cs="Courier New" w:hint="default"/>
+      </w:rPr>
+    </w:lvl>
+    <w:lvl w:ilvl="8" w:tplc="0C000005" w:tentative="1">
+      <w:start w:val="1"/>
+      <w:numFmt w:val="bullet"/>
+      <w:lvlText w:val=""/>
+      <w:lvlJc w:val="left"/>
+      <w:pPr>
+        <w:ind w:left="6480" w:hanging="360"/>
+      </w:pPr>
+      <w:rPr>
+        <w:rFonts w:ascii="Wingdings" w:hAnsi="Wingdings" w:hint="default"/>
+      </w:rPr>
+    </w:lvl>
+  </w:abstractNum>
+  <w:num w:numId="1" w16cid:durableId="761291924">
+    <w:abstractNumId w:val="2"/>
+  </w:num>
+  <w:num w:numId="2" w16cid:durableId="2064211863">
+    <w:abstractNumId w:val="0"/>
+  </w:num>
+  <w:num w:numId="3" w16cid:durableId="1083448880">
+    <w:abstractNumId w:val="1"/>
+  </w:num>
+</w:numbering>
+</file>
+
 <file path=word/styles.xml><?xml version="1.0" encoding="utf-8"?>
 <w:styles xmlns:mc="http://schemas.openxmlformats.org/markup-compatibility/2006" xmlns:r="http://schemas.openxmlformats.org/officeDocument/2006/relationships" xmlns:w="http://schemas.openxmlformats.org/wordprocessingml/2006/main" xmlns:w14="http://schemas.microsoft.com/office/word/2010/wordml" xmlns:w15="http://schemas.microsoft.com/office/word/2012/wordml" xmlns:w16cex="http://schemas.microsoft.com/office/word/2018/wordml/cex" xmlns:w16cid="http://schemas.microsoft.com/office/word/2016/wordml/cid" xmlns:w16="http://schemas.microsoft.com/office/word/2018/wordml" xmlns:w16du="http://schemas.microsoft.com/office/word/2023/wordml/word16du" xmlns:w16sdtdh="http://schemas.microsoft.com/office/word/2020/wordml/sdtdatahash" xmlns:w16sdtfl="http://schemas.microsoft.com/office/word/2024/wordml/sdtformatlock" xmlns:w16se="http://schemas.microsoft.com/office/word/2015/wordml/symex" mc:Ignorable="w14 w15 w16se w16cid w16 w16cex w16sdtdh w16sdtfl w16du">
   <w:docDefaults>
@@ -126,7 +675,7 @@
         <w:kern w:val="2"/>
         <w:sz w:val="24"/>
         <w:szCs w:val="24"/>
-        <w:lang w:eastAsia="en-US" w:bidi="ar-SA"/>
+        <w:lang w:val="en-CH" w:eastAsia="en-US" w:bidi="ar-SA"/>
         <w14:ligatures w14:val="standardContextual"/>
       </w:rPr>
     </w:rPrDefault>
@@ -1029,6 +1578,12 @@
       <w:spacing w:val="5"/>
     </w:rPr>
   </w:style>
+  <w:style w:type="paragraph" w:styleId="NoSpacing">
+    <w:name w:val="No Spacing"/>
+    <w:uiPriority w:val="1"/>
+    <w:qFormat/>
+    <w:rsid w:val="0083655F"/>
+  </w:style>
 </w:styles>
 </file>
 
@@ -1328,23 +1883,6 @@
 </file>
 
 <file path=customXml/item1.xml><?xml version="1.0" encoding="utf-8"?>
-<p:properties xmlns:p="http://schemas.microsoft.com/office/2006/metadata/properties" xmlns:xsi="http://www.w3.org/2001/XMLSchema-instance" xmlns:pc="http://schemas.microsoft.com/office/infopath/2007/PartnerControls">
-  <documentManagement>
-    <_activity xmlns="0dbab07e-16b0-4014-84a9-72f914761e32" xsi:nil="true"/>
-  </documentManagement>
-</p:properties>
-</file>
-
-<file path=customXml/item2.xml><?xml version="1.0" encoding="utf-8"?>
-<?mso-contentType ?>
-<FormTemplates xmlns="http://schemas.microsoft.com/sharepoint/v3/contenttype/forms">
-  <Display>DocumentLibraryForm</Display>
-  <Edit>DocumentLibraryForm</Edit>
-  <New>DocumentLibraryForm</New>
-</FormTemplates>
-</file>
-
-<file path=customXml/item3.xml><?xml version="1.0" encoding="utf-8"?>
 <ct:contentTypeSchema xmlns:ct="http://schemas.microsoft.com/office/2006/metadata/contentType" xmlns:ma="http://schemas.microsoft.com/office/2006/metadata/properties/metaAttributes" ct:_="" ma:_="" ma:contentTypeName="Dokument" ma:contentTypeID="0x0101007B623EEC2AF35B4FB29E1E1FD3A52E92" ma:contentTypeVersion="9" ma:contentTypeDescription="Ein neues Dokument erstellen." ma:contentTypeScope="" ma:versionID="78020f079c1dc479384e80b2dd853b4a">
   <xsd:schema xmlns:xsd="http://www.w3.org/2001/XMLSchema" xmlns:xs="http://www.w3.org/2001/XMLSchema" xmlns:p="http://schemas.microsoft.com/office/2006/metadata/properties" xmlns:ns3="0dbab07e-16b0-4014-84a9-72f914761e32" xmlns:ns4="d056d688-84d3-4fc5-a444-b7b47b867cc8" targetNamespace="http://schemas.microsoft.com/office/2006/metadata/properties" ma:root="true" ma:fieldsID="f88acdbb8f2e41eddf515aeb41c57cdf" ns3:_="" ns4:_="">
     <xsd:import namespace="0dbab07e-16b0-4014-84a9-72f914761e32"/>
@@ -1539,32 +2077,24 @@
 </ct:contentTypeSchema>
 </file>
 
-<file path=customXml/itemProps1.xml><?xml version="1.0" encoding="utf-8"?>
-<ds:datastoreItem xmlns:ds="http://schemas.openxmlformats.org/officeDocument/2006/customXml" ds:itemID="{ABCDBAF9-B1EC-4856-8FC5-213BFCE7DC0D}">
-  <ds:schemaRefs>
-    <ds:schemaRef ds:uri="http://schemas.microsoft.com/office/2006/documentManagement/types"/>
-    <ds:schemaRef ds:uri="http://purl.org/dc/terms/"/>
-    <ds:schemaRef ds:uri="http://schemas.openxmlformats.org/package/2006/metadata/core-properties"/>
-    <ds:schemaRef ds:uri="http://purl.org/dc/dcmitype/"/>
-    <ds:schemaRef ds:uri="http://schemas.microsoft.com/office/infopath/2007/PartnerControls"/>
-    <ds:schemaRef ds:uri="d056d688-84d3-4fc5-a444-b7b47b867cc8"/>
-    <ds:schemaRef ds:uri="http://purl.org/dc/elements/1.1/"/>
-    <ds:schemaRef ds:uri="http://schemas.microsoft.com/office/2006/metadata/properties"/>
-    <ds:schemaRef ds:uri="0dbab07e-16b0-4014-84a9-72f914761e32"/>
-    <ds:schemaRef ds:uri="http://www.w3.org/XML/1998/namespace"/>
-  </ds:schemaRefs>
-</ds:datastoreItem>
+<file path=customXml/item2.xml><?xml version="1.0" encoding="utf-8"?>
+<?mso-contentType ?>
+<FormTemplates xmlns="http://schemas.microsoft.com/sharepoint/v3/contenttype/forms">
+  <Display>DocumentLibraryForm</Display>
+  <Edit>DocumentLibraryForm</Edit>
+  <New>DocumentLibraryForm</New>
+</FormTemplates>
 </file>
 
-<file path=customXml/itemProps2.xml><?xml version="1.0" encoding="utf-8"?>
-<ds:datastoreItem xmlns:ds="http://schemas.openxmlformats.org/officeDocument/2006/customXml" ds:itemID="{7B2CF6B4-E882-4E19-90A0-8171B6C31745}">
-  <ds:schemaRefs>
-    <ds:schemaRef ds:uri="http://schemas.microsoft.com/sharepoint/v3/contenttype/forms"/>
-  </ds:schemaRefs>
-</ds:datastoreItem>
+<file path=customXml/item3.xml><?xml version="1.0" encoding="utf-8"?>
+<p:properties xmlns:p="http://schemas.microsoft.com/office/2006/metadata/properties" xmlns:xsi="http://www.w3.org/2001/XMLSchema-instance" xmlns:pc="http://schemas.microsoft.com/office/infopath/2007/PartnerControls">
+  <documentManagement>
+    <_activity xmlns="0dbab07e-16b0-4014-84a9-72f914761e32" xsi:nil="true"/>
+  </documentManagement>
+</p:properties>
 </file>
 
-<file path=customXml/itemProps3.xml><?xml version="1.0" encoding="utf-8"?>
+<file path=customXml/itemProps1.xml><?xml version="1.0" encoding="utf-8"?>
 <ds:datastoreItem xmlns:ds="http://schemas.openxmlformats.org/officeDocument/2006/customXml" ds:itemID="{8DD9FE22-D518-4BD4-BC4B-0CA426BC0A1C}">
   <ds:schemaRefs>
     <ds:schemaRef ds:uri="http://schemas.microsoft.com/office/2006/metadata/contentType"/>
@@ -1581,4 +2111,22 @@
     <ds:schemaRef ds:uri="http://schemas.microsoft.com/internal/obd"/>
   </ds:schemaRefs>
 </ds:datastoreItem>
+</file>
+
+<file path=customXml/itemProps2.xml><?xml version="1.0" encoding="utf-8"?>
+<ds:datastoreItem xmlns:ds="http://schemas.openxmlformats.org/officeDocument/2006/customXml" ds:itemID="{7B2CF6B4-E882-4E19-90A0-8171B6C31745}">
+  <ds:schemaRefs>
+    <ds:schemaRef ds:uri="http://schemas.microsoft.com/sharepoint/v3/contenttype/forms"/>
+  </ds:schemaRefs>
+</ds:datastoreItem>
+</file>
+
+<file path=customXml/itemProps3.xml><?xml version="1.0" encoding="utf-8"?>
+<ds:datastoreItem xmlns:ds="http://schemas.openxmlformats.org/officeDocument/2006/customXml" ds:itemID="{ABCDBAF9-B1EC-4856-8FC5-213BFCE7DC0D}">
+  <ds:schemaRefs>
+    <ds:schemaRef ds:uri="http://schemas.microsoft.com/office/2006/metadata/properties"/>
+    <ds:schemaRef ds:uri="http://schemas.microsoft.com/office/infopath/2007/PartnerControls"/>
+    <ds:schemaRef ds:uri="0dbab07e-16b0-4014-84a9-72f914761e32"/>
+  </ds:schemaRefs>
+</ds:datastoreItem>
 </file>
</xml_diff>